<commit_message>
Update and refactored the document with new requirements
</commit_message>
<xml_diff>
--- a/docs/SRS-Template.docx
+++ b/docs/SRS-Template.docx
@@ -2602,6 +2602,7 @@
         <w:tc>
           <w:tcPr>
             <w:tcW w:w="3120" w:type="dxa"/>
+            <w:tcMar/>
           </w:tcPr>
           <w:p>
             <w:pPr>
@@ -2615,6 +2616,7 @@
         <w:tc>
           <w:tcPr>
             <w:tcW w:w="3120" w:type="dxa"/>
+            <w:tcMar/>
           </w:tcPr>
           <w:p>
             <w:pPr>
@@ -2628,6 +2630,7 @@
         <w:tc>
           <w:tcPr>
             <w:tcW w:w="3120" w:type="dxa"/>
+            <w:tcMar/>
           </w:tcPr>
           <w:p>
             <w:pPr>
@@ -2646,6 +2649,7 @@
         <w:tc>
           <w:tcPr>
             <w:tcW w:w="3120" w:type="dxa"/>
+            <w:tcMar/>
           </w:tcPr>
           <w:p>
             <w:pPr>
@@ -2659,6 +2663,7 @@
         <w:tc>
           <w:tcPr>
             <w:tcW w:w="3120" w:type="dxa"/>
+            <w:tcMar/>
           </w:tcPr>
           <w:p>
             <w:pPr>
@@ -2672,6 +2677,7 @@
         <w:tc>
           <w:tcPr>
             <w:tcW w:w="3120" w:type="dxa"/>
+            <w:tcMar/>
           </w:tcPr>
           <w:p>
             <w:pPr>
@@ -2690,6 +2696,7 @@
         <w:tc>
           <w:tcPr>
             <w:tcW w:w="3120" w:type="dxa"/>
+            <w:tcMar/>
           </w:tcPr>
           <w:p>
             <w:pPr>
@@ -2703,6 +2710,7 @@
         <w:tc>
           <w:tcPr>
             <w:tcW w:w="3120" w:type="dxa"/>
+            <w:tcMar/>
           </w:tcPr>
           <w:p>
             <w:pPr>
@@ -2716,6 +2724,7 @@
         <w:tc>
           <w:tcPr>
             <w:tcW w:w="3120" w:type="dxa"/>
+            <w:tcMar/>
           </w:tcPr>
           <w:p>
             <w:pPr>
@@ -2734,6 +2743,7 @@
         <w:tc>
           <w:tcPr>
             <w:tcW w:w="3120" w:type="dxa"/>
+            <w:tcMar/>
           </w:tcPr>
           <w:p>
             <w:pPr>
@@ -2748,6 +2758,7 @@
         <w:tc>
           <w:tcPr>
             <w:tcW w:w="3120" w:type="dxa"/>
+            <w:tcMar/>
           </w:tcPr>
           <w:p>
             <w:pPr>
@@ -2761,6 +2772,7 @@
         <w:tc>
           <w:tcPr>
             <w:tcW w:w="3120" w:type="dxa"/>
+            <w:tcMar/>
           </w:tcPr>
           <w:p>
             <w:pPr>
@@ -2773,333 +2785,6 @@
         </w:tc>
       </w:tr>
     </w:tbl>
-    <w:p>
-      <w:pPr>
-        <w:pStyle w:val="Heading2"/>
-        <w:keepNext w:val="0"/>
-        <w:keepLines w:val="0"/>
-        <w:spacing w:before="0"/>
-      </w:pPr>
-      <w:r>
-        <w:rPr>
-          <w:rFonts w:ascii="Times New Roman" w:hAnsi="Times New Roman" w:eastAsia="Times New Roman" w:cs="Times New Roman"/>
-        </w:rPr>
-        <w:t>Communications Interfaces</w:t>
-      </w:r>
-    </w:p>
-    <w:p>
-      <w:pPr>
-        <w:pStyle w:val="ListParagraph"/>
-        <w:numPr>
-          <w:ilvl w:val="0"/>
-          <w:numId w:val="6"/>
-        </w:numPr>
-      </w:pPr>
-      <w:r>
-        <w:rPr>
-          <w:b/>
-          <w:bCs/>
-        </w:rPr>
-        <w:t>Protocol</w:t>
-      </w:r>
-      <w:r>
-        <w:t>: WebSocket (ws:// for development, wss:// for production/secure deployment).</w:t>
-      </w:r>
-    </w:p>
-    <w:p>
-      <w:pPr>
-        <w:pStyle w:val="ListParagraph"/>
-        <w:numPr>
-          <w:ilvl w:val="0"/>
-          <w:numId w:val="6"/>
-        </w:numPr>
-      </w:pPr>
-      <w:r>
-        <w:rPr>
-          <w:b/>
-          <w:bCs/>
-        </w:rPr>
-        <w:t>Message Format</w:t>
-      </w:r>
-      <w:r>
-        <w:t>: JSON objects, e.g.:</w:t>
-      </w:r>
-    </w:p>
-    <w:p>
-      <w:r>
-        <w:t>json</w:t>
-      </w:r>
-    </w:p>
-    <w:p>
-      <w:r>
-        <w:rPr>
-          <w:color w:val="D3D7DE"/>
-        </w:rPr>
-        <w:t>{</w:t>
-      </w:r>
-      <w:r>
-        <w:br/>
-      </w:r>
-      <w:r>
-        <w:rPr>
-          <w:color w:val="EAECF0"/>
-        </w:rPr>
-        <w:t xml:space="preserve">  </w:t>
-      </w:r>
-      <w:r>
-        <w:rPr>
-          <w:color w:val="D3D7DE"/>
-        </w:rPr>
-        <w:t>"</w:t>
-      </w:r>
-      <w:r>
-        <w:rPr>
-          <w:color w:val="F47B85"/>
-        </w:rPr>
-        <w:t>type</w:t>
-      </w:r>
-      <w:r>
-        <w:rPr>
-          <w:color w:val="D3D7DE"/>
-        </w:rPr>
-        <w:t>":</w:t>
-      </w:r>
-      <w:r>
-        <w:rPr>
-          <w:color w:val="EAECF0"/>
-        </w:rPr>
-        <w:t xml:space="preserve"> </w:t>
-      </w:r>
-      <w:r>
-        <w:rPr>
-          <w:color w:val="9BE963"/>
-        </w:rPr>
-        <w:t>"message"</w:t>
-      </w:r>
-      <w:r>
-        <w:rPr>
-          <w:color w:val="D3D7DE"/>
-        </w:rPr>
-        <w:t>,</w:t>
-      </w:r>
-      <w:r>
-        <w:br/>
-      </w:r>
-      <w:r>
-        <w:rPr>
-          <w:color w:val="EAECF0"/>
-        </w:rPr>
-        <w:t xml:space="preserve">  </w:t>
-      </w:r>
-      <w:r>
-        <w:rPr>
-          <w:color w:val="D3D7DE"/>
-        </w:rPr>
-        <w:t>"</w:t>
-      </w:r>
-      <w:r>
-        <w:rPr>
-          <w:color w:val="F47B85"/>
-        </w:rPr>
-        <w:t>sender</w:t>
-      </w:r>
-      <w:r>
-        <w:rPr>
-          <w:color w:val="D3D7DE"/>
-        </w:rPr>
-        <w:t>":</w:t>
-      </w:r>
-      <w:r>
-        <w:rPr>
-          <w:color w:val="EAECF0"/>
-        </w:rPr>
-        <w:t xml:space="preserve"> </w:t>
-      </w:r>
-      <w:r>
-        <w:rPr>
-          <w:color w:val="9BE963"/>
-        </w:rPr>
-        <w:t>"Alice"</w:t>
-      </w:r>
-      <w:r>
-        <w:rPr>
-          <w:color w:val="D3D7DE"/>
-        </w:rPr>
-        <w:t>,</w:t>
-      </w:r>
-      <w:r>
-        <w:br/>
-      </w:r>
-      <w:r>
-        <w:rPr>
-          <w:color w:val="EAECF0"/>
-        </w:rPr>
-        <w:t xml:space="preserve">  </w:t>
-      </w:r>
-      <w:r>
-        <w:rPr>
-          <w:color w:val="D3D7DE"/>
-        </w:rPr>
-        <w:t>"</w:t>
-      </w:r>
-      <w:r>
-        <w:rPr>
-          <w:color w:val="F47B85"/>
-        </w:rPr>
-        <w:t>room</w:t>
-      </w:r>
-      <w:r>
-        <w:rPr>
-          <w:color w:val="D3D7DE"/>
-        </w:rPr>
-        <w:t>":</w:t>
-      </w:r>
-      <w:r>
-        <w:rPr>
-          <w:color w:val="EAECF0"/>
-        </w:rPr>
-        <w:t xml:space="preserve"> </w:t>
-      </w:r>
-      <w:r>
-        <w:rPr>
-          <w:color w:val="9BE963"/>
-        </w:rPr>
-        <w:t>"general"</w:t>
-      </w:r>
-      <w:r>
-        <w:rPr>
-          <w:color w:val="D3D7DE"/>
-        </w:rPr>
-        <w:t>,</w:t>
-      </w:r>
-      <w:r>
-        <w:br/>
-      </w:r>
-      <w:r>
-        <w:rPr>
-          <w:color w:val="EAECF0"/>
-        </w:rPr>
-        <w:t xml:space="preserve">  </w:t>
-      </w:r>
-      <w:r>
-        <w:rPr>
-          <w:color w:val="D3D7DE"/>
-        </w:rPr>
-        <w:t>"</w:t>
-      </w:r>
-      <w:r>
-        <w:rPr>
-          <w:color w:val="F47B85"/>
-        </w:rPr>
-        <w:t>content</w:t>
-      </w:r>
-      <w:r>
-        <w:rPr>
-          <w:color w:val="D3D7DE"/>
-        </w:rPr>
-        <w:t>":</w:t>
-      </w:r>
-      <w:r>
-        <w:rPr>
-          <w:color w:val="EAECF0"/>
-        </w:rPr>
-        <w:t xml:space="preserve"> </w:t>
-      </w:r>
-      <w:r>
-        <w:rPr>
-          <w:color w:val="9BE963"/>
-        </w:rPr>
-        <w:t>"Hello everyone!"</w:t>
-      </w:r>
-      <w:r>
-        <w:rPr>
-          <w:color w:val="D3D7DE"/>
-        </w:rPr>
-        <w:t>,</w:t>
-      </w:r>
-      <w:r>
-        <w:br/>
-      </w:r>
-      <w:r>
-        <w:rPr>
-          <w:color w:val="EAECF0"/>
-        </w:rPr>
-        <w:t xml:space="preserve">  </w:t>
-      </w:r>
-      <w:r>
-        <w:rPr>
-          <w:color w:val="D3D7DE"/>
-        </w:rPr>
-        <w:t>"</w:t>
-      </w:r>
-      <w:r>
-        <w:rPr>
-          <w:color w:val="F47B85"/>
-        </w:rPr>
-        <w:t>timestamp</w:t>
-      </w:r>
-      <w:r>
-        <w:rPr>
-          <w:color w:val="D3D7DE"/>
-        </w:rPr>
-        <w:t>":</w:t>
-      </w:r>
-      <w:r>
-        <w:rPr>
-          <w:color w:val="EAECF0"/>
-        </w:rPr>
-        <w:t xml:space="preserve"> </w:t>
-      </w:r>
-      <w:r>
-        <w:rPr>
-          <w:color w:val="9BE963"/>
-        </w:rPr>
-        <w:t>"2026-09-08T10:15:00Z"</w:t>
-      </w:r>
-      <w:r>
-        <w:br/>
-      </w:r>
-      <w:r>
-        <w:rPr>
-          <w:color w:val="D3D7DE"/>
-        </w:rPr>
-        <w:t>}</w:t>
-      </w:r>
-    </w:p>
-    <w:p>
-      <w:pPr>
-        <w:pStyle w:val="ListParagraph"/>
-        <w:numPr>
-          <w:ilvl w:val="0"/>
-          <w:numId w:val="5"/>
-        </w:numPr>
-      </w:pPr>
-      <w:r>
-        <w:rPr>
-          <w:b/>
-          <w:bCs/>
-        </w:rPr>
-        <w:t>Event types</w:t>
-      </w:r>
-      <w:r>
-        <w:t>: connect, disconnect, join_room, leave_room, message, typing.</w:t>
-      </w:r>
-    </w:p>
-    <w:p>
-      <w:pPr>
-        <w:pStyle w:val="normal1"/>
-        <w:spacing w:after="0" w:line="240" w:lineRule="auto"/>
-        <w:jc w:val="both"/>
-        <w:rPr>
-          <w:rFonts w:ascii="Times New Roman" w:hAnsi="Times New Roman" w:eastAsia="Times New Roman" w:cs="Times New Roman"/>
-          <w:i/>
-          <w:iCs/>
-          <w:color w:val="000000" w:themeColor="text2"/>
-          <w:sz w:val="22"/>
-          <w:szCs w:val="22"/>
-        </w:rPr>
-      </w:pPr>
-    </w:p>
     <w:p>
       <w:pPr>
         <w:pStyle w:val="normal1"/>
@@ -4920,19 +4605,19 @@
     </w:p>
     <w:tbl>
       <w:tblPr>
-        <w:tblW w:w="9461" w:type="dxa"/>
+        <w:tblW w:w="9492" w:type="dxa"/>
         <w:tblLayout w:type="fixed"/>
         <w:tblLook w:val="0400" w:firstRow="0" w:lastRow="0" w:firstColumn="0" w:lastColumn="0" w:noHBand="0" w:noVBand="1"/>
       </w:tblPr>
       <w:tblGrid>
-        <w:gridCol w:w="510"/>
-        <w:gridCol w:w="1230"/>
+        <w:gridCol w:w="645"/>
+        <w:gridCol w:w="1095"/>
         <w:gridCol w:w="1530"/>
         <w:gridCol w:w="1485"/>
         <w:gridCol w:w="1260"/>
         <w:gridCol w:w="1380"/>
-        <w:gridCol w:w="1005"/>
-        <w:gridCol w:w="1061"/>
+        <w:gridCol w:w="1050"/>
+        <w:gridCol w:w="1047"/>
       </w:tblGrid>
       <w:tr>
         <w:trPr>
@@ -4940,7 +4625,7 @@
         </w:trPr>
         <w:tc>
           <w:tcPr>
-            <w:tcW w:w="510" w:type="dxa"/>
+            <w:tcW w:w="645" w:type="dxa"/>
             <w:tcBorders>
               <w:top w:val="single" w:color="000000" w:themeColor="text2" w:sz="4" w:space="0"/>
               <w:left w:val="single" w:color="000000" w:themeColor="text2" w:sz="4" w:space="0"/>
@@ -4956,15 +4641,15 @@
               <w:jc w:val="both"/>
               <w:rPr>
                 <w:rFonts w:ascii="Times New Roman" w:hAnsi="Times New Roman" w:eastAsia="Times New Roman" w:cs="Times New Roman"/>
-                <w:b/>
-                <w:bCs/>
-              </w:rPr>
-            </w:pPr>
-            <w:r>
-              <w:rPr>
-                <w:rFonts w:ascii="Times New Roman" w:hAnsi="Times New Roman" w:eastAsia="Times New Roman" w:cs="Times New Roman"/>
-                <w:b/>
-                <w:bCs/>
+                <w:b w:val="1"/>
+                <w:bCs w:val="1"/>
+              </w:rPr>
+            </w:pPr>
+            <w:r>
+              <w:rPr>
+                <w:rFonts w:ascii="Times New Roman" w:hAnsi="Times New Roman" w:eastAsia="Times New Roman" w:cs="Times New Roman"/>
+                <w:b w:val="1"/>
+                <w:bCs w:val="1"/>
               </w:rPr>
               <w:t>Sl. No</w:t>
             </w:r>
@@ -4972,7 +4657,7 @@
         </w:tc>
         <w:tc>
           <w:tcPr>
-            <w:tcW w:w="1230" w:type="dxa"/>
+            <w:tcW w:w="1095" w:type="dxa"/>
             <w:tcBorders>
               <w:top w:val="single" w:color="000000" w:themeColor="text2" w:sz="4" w:space="0"/>
               <w:left w:val="single" w:color="000000" w:themeColor="text2" w:sz="4" w:space="0"/>
@@ -4988,15 +4673,15 @@
               <w:jc w:val="both"/>
               <w:rPr>
                 <w:rFonts w:ascii="Times New Roman" w:hAnsi="Times New Roman" w:eastAsia="Times New Roman" w:cs="Times New Roman"/>
-                <w:b/>
-                <w:bCs/>
-              </w:rPr>
-            </w:pPr>
-            <w:r>
-              <w:rPr>
-                <w:rFonts w:ascii="Times New Roman" w:hAnsi="Times New Roman" w:eastAsia="Times New Roman" w:cs="Times New Roman"/>
-                <w:b/>
-                <w:bCs/>
+                <w:b w:val="1"/>
+                <w:bCs w:val="1"/>
+              </w:rPr>
+            </w:pPr>
+            <w:r>
+              <w:rPr>
+                <w:rFonts w:ascii="Times New Roman" w:hAnsi="Times New Roman" w:eastAsia="Times New Roman" w:cs="Times New Roman"/>
+                <w:b w:val="1"/>
+                <w:bCs w:val="1"/>
               </w:rPr>
               <w:t>Requirement ID</w:t>
             </w:r>
@@ -5020,15 +4705,15 @@
               <w:jc w:val="both"/>
               <w:rPr>
                 <w:rFonts w:ascii="Times New Roman" w:hAnsi="Times New Roman" w:eastAsia="Times New Roman" w:cs="Times New Roman"/>
-                <w:b/>
-                <w:bCs/>
-              </w:rPr>
-            </w:pPr>
-            <w:r>
-              <w:rPr>
-                <w:rFonts w:ascii="Times New Roman" w:hAnsi="Times New Roman" w:eastAsia="Times New Roman" w:cs="Times New Roman"/>
-                <w:b/>
-                <w:bCs/>
+                <w:b w:val="1"/>
+                <w:bCs w:val="1"/>
+              </w:rPr>
+            </w:pPr>
+            <w:r>
+              <w:rPr>
+                <w:rFonts w:ascii="Times New Roman" w:hAnsi="Times New Roman" w:eastAsia="Times New Roman" w:cs="Times New Roman"/>
+                <w:b w:val="1"/>
+                <w:bCs w:val="1"/>
               </w:rPr>
               <w:t>Brief Description of Requirement</w:t>
             </w:r>
@@ -5101,15 +4786,15 @@
               <w:jc w:val="both"/>
               <w:rPr>
                 <w:rFonts w:ascii="Times New Roman" w:hAnsi="Times New Roman" w:eastAsia="Times New Roman" w:cs="Times New Roman"/>
-                <w:b/>
-                <w:bCs/>
-              </w:rPr>
-            </w:pPr>
-            <w:r>
-              <w:rPr>
-                <w:rFonts w:ascii="Times New Roman" w:hAnsi="Times New Roman" w:eastAsia="Times New Roman" w:cs="Times New Roman"/>
-                <w:b/>
-                <w:bCs/>
+                <w:b w:val="1"/>
+                <w:bCs w:val="1"/>
+              </w:rPr>
+            </w:pPr>
+            <w:r>
+              <w:rPr>
+                <w:rFonts w:ascii="Times New Roman" w:hAnsi="Times New Roman" w:eastAsia="Times New Roman" w:cs="Times New Roman"/>
+                <w:b w:val="1"/>
+                <w:bCs w:val="1"/>
               </w:rPr>
               <w:t xml:space="preserve">Design Reference </w:t>
             </w:r>
@@ -5133,15 +4818,15 @@
               <w:jc w:val="both"/>
               <w:rPr>
                 <w:rFonts w:ascii="Times New Roman" w:hAnsi="Times New Roman" w:eastAsia="Times New Roman" w:cs="Times New Roman"/>
-                <w:b/>
-                <w:bCs/>
-              </w:rPr>
-            </w:pPr>
-            <w:r>
-              <w:rPr>
-                <w:rFonts w:ascii="Times New Roman" w:hAnsi="Times New Roman" w:eastAsia="Times New Roman" w:cs="Times New Roman"/>
-                <w:b/>
-                <w:bCs/>
+                <w:b w:val="1"/>
+                <w:bCs w:val="1"/>
+              </w:rPr>
+            </w:pPr>
+            <w:r>
+              <w:rPr>
+                <w:rFonts w:ascii="Times New Roman" w:hAnsi="Times New Roman" w:eastAsia="Times New Roman" w:cs="Times New Roman"/>
+                <w:b w:val="1"/>
+                <w:bCs w:val="1"/>
               </w:rPr>
               <w:t>Code File Reference</w:t>
             </w:r>
@@ -5149,7 +4834,7 @@
         </w:tc>
         <w:tc>
           <w:tcPr>
-            <w:tcW w:w="1005" w:type="dxa"/>
+            <w:tcW w:w="1050" w:type="dxa"/>
             <w:tcBorders>
               <w:top w:val="single" w:color="000000" w:themeColor="text2" w:sz="4" w:space="0"/>
               <w:left w:val="single" w:color="000000" w:themeColor="text2" w:sz="4" w:space="0"/>
@@ -5165,15 +4850,15 @@
               <w:jc w:val="both"/>
               <w:rPr>
                 <w:rFonts w:ascii="Times New Roman" w:hAnsi="Times New Roman" w:eastAsia="Times New Roman" w:cs="Times New Roman"/>
-                <w:b/>
-                <w:bCs/>
-              </w:rPr>
-            </w:pPr>
-            <w:r>
-              <w:rPr>
-                <w:rFonts w:ascii="Times New Roman" w:hAnsi="Times New Roman" w:eastAsia="Times New Roman" w:cs="Times New Roman"/>
-                <w:b/>
-                <w:bCs/>
+                <w:b w:val="1"/>
+                <w:bCs w:val="1"/>
+              </w:rPr>
+            </w:pPr>
+            <w:r>
+              <w:rPr>
+                <w:rFonts w:ascii="Times New Roman" w:hAnsi="Times New Roman" w:eastAsia="Times New Roman" w:cs="Times New Roman"/>
+                <w:b w:val="1"/>
+                <w:bCs w:val="1"/>
               </w:rPr>
               <w:t xml:space="preserve"> Test Case ID</w:t>
             </w:r>
@@ -5181,7 +4866,7 @@
         </w:tc>
         <w:tc>
           <w:tcPr>
-            <w:tcW w:w="1061" w:type="dxa"/>
+            <w:tcW w:w="1047" w:type="dxa"/>
             <w:tcBorders>
               <w:top w:val="single" w:color="000000" w:themeColor="text2" w:sz="4" w:space="0"/>
               <w:left w:val="single" w:color="000000" w:themeColor="text2" w:sz="4" w:space="0"/>
@@ -5197,15 +4882,15 @@
               <w:jc w:val="both"/>
               <w:rPr>
                 <w:rFonts w:ascii="Times New Roman" w:hAnsi="Times New Roman" w:eastAsia="Times New Roman" w:cs="Times New Roman"/>
-                <w:b/>
-                <w:bCs/>
-              </w:rPr>
-            </w:pPr>
-            <w:r>
-              <w:rPr>
-                <w:rFonts w:ascii="Times New Roman" w:hAnsi="Times New Roman" w:eastAsia="Times New Roman" w:cs="Times New Roman"/>
-                <w:b/>
-                <w:bCs/>
+                <w:b w:val="1"/>
+                <w:bCs w:val="1"/>
+              </w:rPr>
+            </w:pPr>
+            <w:r>
+              <w:rPr>
+                <w:rFonts w:ascii="Times New Roman" w:hAnsi="Times New Roman" w:eastAsia="Times New Roman" w:cs="Times New Roman"/>
+                <w:b w:val="1"/>
+                <w:bCs w:val="1"/>
               </w:rPr>
               <w:t>System Test Case ID</w:t>
             </w:r>
@@ -5218,7 +4903,7 @@
         </w:trPr>
         <w:tc>
           <w:tcPr>
-            <w:tcW w:w="510" w:type="dxa"/>
+            <w:tcW w:w="645" w:type="dxa"/>
             <w:tcBorders>
               <w:top w:val="single" w:color="000000" w:themeColor="text2" w:sz="4" w:space="0"/>
               <w:left w:val="single" w:color="000000" w:themeColor="text2" w:sz="4" w:space="0"/>
@@ -5231,6 +4916,9 @@
             <w:pPr>
               <w:pStyle w:val="normal1"/>
               <w:jc w:val="both"/>
+              <w:rPr>
+                <w:rFonts w:ascii="Times New Roman" w:hAnsi="Times New Roman" w:eastAsia="Times New Roman" w:cs="Times New Roman"/>
+              </w:rPr>
             </w:pPr>
             <w:r>
               <w:rPr>
@@ -5242,7 +4930,7 @@
         </w:tc>
         <w:tc>
           <w:tcPr>
-            <w:tcW w:w="1230" w:type="dxa"/>
+            <w:tcW w:w="1095" w:type="dxa"/>
             <w:tcBorders>
               <w:top w:val="single" w:color="000000" w:themeColor="text2" w:sz="4" w:space="0"/>
               <w:left w:val="single" w:color="000000" w:themeColor="text2" w:sz="4" w:space="0"/>
@@ -5255,6 +4943,9 @@
             <w:pPr>
               <w:pStyle w:val="normal1"/>
               <w:jc w:val="both"/>
+              <w:rPr>
+                <w:rFonts w:ascii="Times New Roman" w:hAnsi="Times New Roman" w:eastAsia="Times New Roman" w:cs="Times New Roman"/>
+              </w:rPr>
             </w:pPr>
             <w:r>
               <w:rPr>
@@ -5279,6 +4970,9 @@
             <w:pPr>
               <w:pStyle w:val="normal1"/>
               <w:jc w:val="both"/>
+              <w:rPr>
+                <w:rFonts w:ascii="Times New Roman" w:hAnsi="Times New Roman" w:eastAsia="Times New Roman" w:cs="Times New Roman"/>
+              </w:rPr>
             </w:pPr>
             <w:r>
               <w:rPr>
@@ -5291,6 +4985,9 @@
             <w:pPr>
               <w:pStyle w:val="normal1"/>
               <w:jc w:val="both"/>
+              <w:rPr>
+                <w:rFonts w:ascii="Times New Roman" w:hAnsi="Times New Roman" w:eastAsia="Times New Roman" w:cs="Times New Roman"/>
+              </w:rPr>
             </w:pPr>
             <w:r>
               <w:rPr>
@@ -5303,6 +5000,9 @@
             <w:pPr>
               <w:pStyle w:val="normal1"/>
               <w:jc w:val="both"/>
+              <w:rPr>
+                <w:rFonts w:ascii="Times New Roman" w:hAnsi="Times New Roman" w:eastAsia="Times New Roman" w:cs="Times New Roman"/>
+              </w:rPr>
             </w:pPr>
             <w:r>
               <w:rPr>
@@ -5348,6 +5048,9 @@
             <w:pPr>
               <w:pStyle w:val="normal1"/>
               <w:jc w:val="both"/>
+              <w:rPr>
+                <w:rFonts w:ascii="Times New Roman" w:hAnsi="Times New Roman" w:eastAsia="Times New Roman" w:cs="Times New Roman"/>
+              </w:rPr>
             </w:pPr>
             <w:r>
               <w:rPr>
@@ -5372,6 +5075,9 @@
             <w:pPr>
               <w:pStyle w:val="normal1"/>
               <w:jc w:val="both"/>
+              <w:rPr>
+                <w:rFonts w:ascii="Times New Roman" w:hAnsi="Times New Roman" w:eastAsia="Times New Roman" w:cs="Times New Roman"/>
+              </w:rPr>
             </w:pPr>
             <w:r>
               <w:rPr>
@@ -5383,7 +5089,7 @@
         </w:tc>
         <w:tc>
           <w:tcPr>
-            <w:tcW w:w="1005" w:type="dxa"/>
+            <w:tcW w:w="1050" w:type="dxa"/>
             <w:tcBorders>
               <w:top w:val="single" w:color="000000" w:themeColor="text2" w:sz="4" w:space="0"/>
               <w:left w:val="single" w:color="000000" w:themeColor="text2" w:sz="4" w:space="0"/>
@@ -5396,6 +5102,9 @@
             <w:pPr>
               <w:pStyle w:val="normal1"/>
               <w:jc w:val="both"/>
+              <w:rPr>
+                <w:rFonts w:ascii="Times New Roman" w:hAnsi="Times New Roman" w:eastAsia="Times New Roman" w:cs="Times New Roman"/>
+              </w:rPr>
             </w:pPr>
             <w:r>
               <w:rPr>
@@ -5407,7 +5116,7 @@
         </w:tc>
         <w:tc>
           <w:tcPr>
-            <w:tcW w:w="1061" w:type="dxa"/>
+            <w:tcW w:w="1047" w:type="dxa"/>
             <w:tcBorders>
               <w:top w:val="single" w:color="000000" w:themeColor="text2" w:sz="4" w:space="0"/>
               <w:left w:val="single" w:color="000000" w:themeColor="text2" w:sz="4" w:space="0"/>
@@ -5433,7 +5142,7 @@
         </w:trPr>
         <w:tc>
           <w:tcPr>
-            <w:tcW w:w="510" w:type="dxa"/>
+            <w:tcW w:w="645" w:type="dxa"/>
             <w:tcBorders>
               <w:top w:val="single" w:color="000000" w:themeColor="text2" w:sz="4" w:space="0"/>
               <w:left w:val="single" w:color="000000" w:themeColor="text2" w:sz="4" w:space="0"/>
@@ -5446,6 +5155,9 @@
             <w:pPr>
               <w:pStyle w:val="normal1"/>
               <w:jc w:val="both"/>
+              <w:rPr>
+                <w:rFonts w:ascii="Times New Roman" w:hAnsi="Times New Roman" w:eastAsia="Times New Roman" w:cs="Times New Roman"/>
+              </w:rPr>
             </w:pPr>
             <w:r>
               <w:rPr>
@@ -5457,7 +5169,7 @@
         </w:tc>
         <w:tc>
           <w:tcPr>
-            <w:tcW w:w="1230" w:type="dxa"/>
+            <w:tcW w:w="1095" w:type="dxa"/>
             <w:tcBorders>
               <w:top w:val="single" w:color="000000" w:themeColor="text2" w:sz="4" w:space="0"/>
               <w:left w:val="single" w:color="000000" w:themeColor="text2" w:sz="4" w:space="0"/>
@@ -5470,6 +5182,9 @@
             <w:pPr>
               <w:pStyle w:val="normal1"/>
               <w:jc w:val="both"/>
+              <w:rPr>
+                <w:rFonts w:ascii="Times New Roman" w:hAnsi="Times New Roman" w:eastAsia="Times New Roman" w:cs="Times New Roman"/>
+              </w:rPr>
             </w:pPr>
             <w:r>
               <w:rPr>
@@ -5494,6 +5209,9 @@
             <w:pPr>
               <w:pStyle w:val="normal1"/>
               <w:jc w:val="both"/>
+              <w:rPr>
+                <w:rFonts w:ascii="Times New Roman" w:hAnsi="Times New Roman" w:eastAsia="Times New Roman" w:cs="Times New Roman"/>
+              </w:rPr>
             </w:pPr>
             <w:r>
               <w:rPr>
@@ -5506,6 +5224,9 @@
             <w:pPr>
               <w:pStyle w:val="normal1"/>
               <w:jc w:val="both"/>
+              <w:rPr>
+                <w:rFonts w:ascii="Times New Roman" w:hAnsi="Times New Roman" w:eastAsia="Times New Roman" w:cs="Times New Roman"/>
+              </w:rPr>
             </w:pPr>
             <w:r>
               <w:rPr>
@@ -5551,6 +5272,9 @@
             <w:pPr>
               <w:pStyle w:val="normal1"/>
               <w:jc w:val="both"/>
+              <w:rPr>
+                <w:rFonts w:ascii="Times New Roman" w:hAnsi="Times New Roman" w:eastAsia="Times New Roman" w:cs="Times New Roman"/>
+              </w:rPr>
             </w:pPr>
             <w:r>
               <w:rPr>
@@ -5575,6 +5299,9 @@
             <w:pPr>
               <w:pStyle w:val="normal1"/>
               <w:jc w:val="both"/>
+              <w:rPr>
+                <w:rFonts w:ascii="Times New Roman" w:hAnsi="Times New Roman" w:eastAsia="Times New Roman" w:cs="Times New Roman"/>
+              </w:rPr>
             </w:pPr>
             <w:r>
               <w:rPr>
@@ -5586,7 +5313,7 @@
         </w:tc>
         <w:tc>
           <w:tcPr>
-            <w:tcW w:w="1005" w:type="dxa"/>
+            <w:tcW w:w="1050" w:type="dxa"/>
             <w:tcBorders>
               <w:top w:val="single" w:color="000000" w:themeColor="text2" w:sz="4" w:space="0"/>
               <w:left w:val="single" w:color="000000" w:themeColor="text2" w:sz="4" w:space="0"/>
@@ -5599,6 +5326,9 @@
             <w:pPr>
               <w:pStyle w:val="normal1"/>
               <w:jc w:val="both"/>
+              <w:rPr>
+                <w:rFonts w:ascii="Times New Roman" w:hAnsi="Times New Roman" w:eastAsia="Times New Roman" w:cs="Times New Roman"/>
+              </w:rPr>
             </w:pPr>
             <w:r>
               <w:rPr>
@@ -5610,7 +5340,7 @@
         </w:tc>
         <w:tc>
           <w:tcPr>
-            <w:tcW w:w="1061" w:type="dxa"/>
+            <w:tcW w:w="1047" w:type="dxa"/>
             <w:tcBorders>
               <w:top w:val="single" w:color="000000" w:themeColor="text2" w:sz="4" w:space="0"/>
               <w:left w:val="single" w:color="000000" w:themeColor="text2" w:sz="4" w:space="0"/>
@@ -5636,7 +5366,7 @@
         </w:trPr>
         <w:tc>
           <w:tcPr>
-            <w:tcW w:w="510" w:type="dxa"/>
+            <w:tcW w:w="645" w:type="dxa"/>
             <w:tcBorders>
               <w:top w:val="single" w:color="000000" w:themeColor="text2" w:sz="4" w:space="0"/>
               <w:left w:val="single" w:color="000000" w:themeColor="text2" w:sz="4" w:space="0"/>
@@ -5649,6 +5379,9 @@
             <w:pPr>
               <w:pStyle w:val="normal1"/>
               <w:jc w:val="both"/>
+              <w:rPr>
+                <w:rFonts w:ascii="Times New Roman" w:hAnsi="Times New Roman" w:eastAsia="Times New Roman" w:cs="Times New Roman"/>
+              </w:rPr>
             </w:pPr>
             <w:r>
               <w:rPr>
@@ -5660,7 +5393,7 @@
         </w:tc>
         <w:tc>
           <w:tcPr>
-            <w:tcW w:w="1230" w:type="dxa"/>
+            <w:tcW w:w="1095" w:type="dxa"/>
             <w:tcBorders>
               <w:top w:val="single" w:color="000000" w:themeColor="text2" w:sz="4" w:space="0"/>
               <w:left w:val="single" w:color="000000" w:themeColor="text2" w:sz="4" w:space="0"/>
@@ -5673,6 +5406,9 @@
             <w:pPr>
               <w:pStyle w:val="normal1"/>
               <w:jc w:val="both"/>
+              <w:rPr>
+                <w:rFonts w:ascii="Times New Roman" w:hAnsi="Times New Roman" w:eastAsia="Times New Roman" w:cs="Times New Roman"/>
+              </w:rPr>
             </w:pPr>
             <w:r>
               <w:rPr>
@@ -5697,6 +5433,9 @@
             <w:pPr>
               <w:pStyle w:val="normal1"/>
               <w:jc w:val="both"/>
+              <w:rPr>
+                <w:rFonts w:ascii="Times New Roman" w:hAnsi="Times New Roman" w:eastAsia="Times New Roman" w:cs="Times New Roman"/>
+              </w:rPr>
             </w:pPr>
             <w:r>
               <w:rPr>
@@ -5742,6 +5481,9 @@
             <w:pPr>
               <w:pStyle w:val="normal1"/>
               <w:jc w:val="both"/>
+              <w:rPr>
+                <w:rFonts w:ascii="Times New Roman" w:hAnsi="Times New Roman" w:eastAsia="Times New Roman" w:cs="Times New Roman"/>
+              </w:rPr>
             </w:pPr>
             <w:r>
               <w:rPr>
@@ -5766,6 +5508,9 @@
             <w:pPr>
               <w:pStyle w:val="normal1"/>
               <w:jc w:val="both"/>
+              <w:rPr>
+                <w:rFonts w:ascii="Times New Roman" w:hAnsi="Times New Roman" w:eastAsia="Times New Roman" w:cs="Times New Roman"/>
+              </w:rPr>
             </w:pPr>
             <w:r>
               <w:rPr>
@@ -5777,7 +5522,7 @@
         </w:tc>
         <w:tc>
           <w:tcPr>
-            <w:tcW w:w="1005" w:type="dxa"/>
+            <w:tcW w:w="1050" w:type="dxa"/>
             <w:tcBorders>
               <w:top w:val="single" w:color="000000" w:themeColor="text2" w:sz="4" w:space="0"/>
               <w:left w:val="single" w:color="000000" w:themeColor="text2" w:sz="4" w:space="0"/>
@@ -5790,6 +5535,9 @@
             <w:pPr>
               <w:pStyle w:val="normal1"/>
               <w:jc w:val="both"/>
+              <w:rPr>
+                <w:rFonts w:ascii="Times New Roman" w:hAnsi="Times New Roman" w:eastAsia="Times New Roman" w:cs="Times New Roman"/>
+              </w:rPr>
             </w:pPr>
             <w:r>
               <w:rPr>
@@ -5801,7 +5549,485 @@
         </w:tc>
         <w:tc>
           <w:tcPr>
-            <w:tcW w:w="1061" w:type="dxa"/>
+            <w:tcW w:w="1047" w:type="dxa"/>
+            <w:tcBorders>
+              <w:top w:val="single" w:color="000000" w:themeColor="text2" w:sz="4" w:space="0"/>
+              <w:left w:val="single" w:color="000000" w:themeColor="text2" w:sz="4" w:space="0"/>
+              <w:bottom w:val="single" w:color="000000" w:themeColor="text2" w:sz="4" w:space="0"/>
+              <w:right w:val="single" w:color="000000" w:themeColor="text2" w:sz="4" w:space="0"/>
+            </w:tcBorders>
+            <w:tcMar/>
+          </w:tcPr>
+          <w:p>
+            <w:pPr>
+              <w:pStyle w:val="normal1"/>
+              <w:jc w:val="both"/>
+              <w:rPr>
+                <w:rFonts w:ascii="Times New Roman" w:hAnsi="Times New Roman" w:eastAsia="Times New Roman" w:cs="Times New Roman"/>
+              </w:rPr>
+            </w:pPr>
+          </w:p>
+        </w:tc>
+      </w:tr>
+      <w:tr>
+        <w:trPr>
+          <w:trHeight w:val="252"/>
+        </w:trPr>
+        <w:tc>
+          <w:tcPr>
+            <w:tcW w:w="645" w:type="dxa"/>
+            <w:tcBorders>
+              <w:top w:val="single" w:color="000000" w:themeColor="text2" w:sz="4" w:space="0"/>
+              <w:left w:val="single" w:color="000000" w:themeColor="text2" w:sz="4" w:space="0"/>
+              <w:bottom w:val="single" w:color="000000" w:themeColor="text2" w:sz="4" w:space="0"/>
+              <w:right w:val="single" w:color="000000" w:themeColor="text2" w:sz="4" w:space="0"/>
+            </w:tcBorders>
+            <w:tcMar/>
+          </w:tcPr>
+          <w:p>
+            <w:pPr>
+              <w:pStyle w:val="normal1"/>
+              <w:jc w:val="both"/>
+              <w:rPr>
+                <w:rFonts w:ascii="Times New Roman" w:hAnsi="Times New Roman" w:eastAsia="Times New Roman" w:cs="Times New Roman"/>
+              </w:rPr>
+            </w:pPr>
+            <w:r>
+              <w:rPr>
+                <w:rFonts w:ascii="Times New Roman" w:hAnsi="Times New Roman" w:eastAsia="Times New Roman" w:cs="Times New Roman"/>
+              </w:rPr>
+              <w:t>4</w:t>
+            </w:r>
+          </w:p>
+        </w:tc>
+        <w:tc>
+          <w:tcPr>
+            <w:tcW w:w="1095" w:type="dxa"/>
+            <w:tcBorders>
+              <w:top w:val="single" w:color="000000" w:themeColor="text2" w:sz="4" w:space="0"/>
+              <w:left w:val="single" w:color="000000" w:themeColor="text2" w:sz="4" w:space="0"/>
+              <w:bottom w:val="single" w:color="000000" w:themeColor="text2" w:sz="4" w:space="0"/>
+              <w:right w:val="single" w:color="000000" w:themeColor="text2" w:sz="4" w:space="0"/>
+            </w:tcBorders>
+            <w:tcMar/>
+          </w:tcPr>
+          <w:p>
+            <w:pPr>
+              <w:pStyle w:val="normal1"/>
+              <w:jc w:val="both"/>
+              <w:rPr>
+                <w:rFonts w:ascii="Times New Roman" w:hAnsi="Times New Roman" w:eastAsia="Times New Roman" w:cs="Times New Roman"/>
+                <w:noProof w:val="0"/>
+                <w:lang w:val="en-US"/>
+              </w:rPr>
+            </w:pPr>
+            <w:r>
+              <w:rPr>
+                <w:rFonts w:ascii="Times New Roman" w:hAnsi="Times New Roman" w:eastAsia="Times New Roman" w:cs="Times New Roman"/>
+                <w:noProof w:val="0"/>
+                <w:lang w:val="en-US"/>
+              </w:rPr>
+              <w:t>REQ-2</w:t>
+            </w:r>
+          </w:p>
+        </w:tc>
+        <w:tc>
+          <w:tcPr>
+            <w:tcW w:w="1530" w:type="dxa"/>
+            <w:tcBorders>
+              <w:top w:val="single" w:color="000000" w:themeColor="text2" w:sz="4" w:space="0"/>
+              <w:left w:val="single" w:color="000000" w:themeColor="text2" w:sz="4" w:space="0"/>
+              <w:bottom w:val="single" w:color="000000" w:themeColor="text2" w:sz="4" w:space="0"/>
+              <w:right w:val="single" w:color="000000" w:themeColor="text2" w:sz="4" w:space="0"/>
+            </w:tcBorders>
+            <w:tcMar/>
+          </w:tcPr>
+          <w:p>
+            <w:pPr>
+              <w:pStyle w:val="normal1"/>
+              <w:jc w:val="both"/>
+              <w:rPr>
+                <w:rFonts w:ascii="Times New Roman" w:hAnsi="Times New Roman" w:eastAsia="Times New Roman" w:cs="Times New Roman"/>
+                <w:noProof w:val="0"/>
+                <w:lang w:val="en-US"/>
+              </w:rPr>
+            </w:pPr>
+            <w:r>
+              <w:rPr>
+                <w:rFonts w:ascii="Times New Roman" w:hAnsi="Times New Roman" w:eastAsia="Times New Roman" w:cs="Times New Roman"/>
+                <w:noProof w:val="0"/>
+                <w:lang w:val="en-US"/>
+              </w:rPr>
+              <w:t>Reject invalid WebSocket handshake attempts and display an error</w:t>
+            </w:r>
+          </w:p>
+        </w:tc>
+        <w:tc>
+          <w:tcPr>
+            <w:tcW w:w="1485" w:type="dxa"/>
+            <w:tcBorders>
+              <w:top w:val="single" w:color="000000" w:themeColor="text2" w:sz="4"/>
+              <w:left w:val="single" w:color="000000" w:themeColor="text2" w:sz="4"/>
+              <w:bottom w:val="single" w:color="000000" w:themeColor="text2" w:sz="4"/>
+              <w:right w:val="single" w:color="000000" w:themeColor="text2" w:sz="4"/>
+            </w:tcBorders>
+            <w:tcMar/>
+          </w:tcPr>
+          <w:p>
+            <w:pPr>
+              <w:pStyle w:val="normal1"/>
+              <w:jc w:val="both"/>
+              <w:rPr>
+                <w:rFonts w:ascii="Times New Roman" w:hAnsi="Times New Roman" w:eastAsia="Times New Roman" w:cs="Times New Roman"/>
+                <w:noProof w:val="0"/>
+                <w:lang w:val="en-US"/>
+              </w:rPr>
+            </w:pPr>
+            <w:r>
+              <w:rPr>
+                <w:rFonts w:ascii="Times New Roman" w:hAnsi="Times New Roman" w:eastAsia="Times New Roman" w:cs="Times New Roman"/>
+                <w:noProof w:val="0"/>
+                <w:lang w:val="en-US"/>
+              </w:rPr>
+              <w:t>Sec 4.1</w:t>
+            </w:r>
+          </w:p>
+        </w:tc>
+        <w:tc>
+          <w:tcPr>
+            <w:tcW w:w="1260" w:type="dxa"/>
+            <w:tcBorders>
+              <w:top w:val="single" w:color="000000" w:themeColor="text2" w:sz="4" w:space="0"/>
+              <w:left w:val="single" w:color="000000" w:themeColor="text2" w:sz="4" w:space="0"/>
+              <w:bottom w:val="single" w:color="000000" w:themeColor="text2" w:sz="4" w:space="0"/>
+              <w:right w:val="single" w:color="000000" w:themeColor="text2" w:sz="4" w:space="0"/>
+            </w:tcBorders>
+            <w:tcMar/>
+          </w:tcPr>
+          <w:p>
+            <w:pPr>
+              <w:pStyle w:val="normal1"/>
+              <w:jc w:val="both"/>
+              <w:rPr>
+                <w:rFonts w:ascii="Times New Roman" w:hAnsi="Times New Roman" w:eastAsia="Times New Roman" w:cs="Times New Roman"/>
+                <w:noProof w:val="0"/>
+                <w:lang w:val="en-US"/>
+              </w:rPr>
+            </w:pPr>
+            <w:r>
+              <w:rPr>
+                <w:rFonts w:ascii="Times New Roman" w:hAnsi="Times New Roman" w:eastAsia="Times New Roman" w:cs="Times New Roman"/>
+                <w:noProof w:val="0"/>
+                <w:lang w:val="en-US"/>
+              </w:rPr>
+              <w:t>Connection Handler</w:t>
+            </w:r>
+          </w:p>
+        </w:tc>
+        <w:tc>
+          <w:tcPr>
+            <w:tcW w:w="1380" w:type="dxa"/>
+            <w:tcBorders>
+              <w:top w:val="single" w:color="000000" w:themeColor="text2" w:sz="4" w:space="0"/>
+              <w:left w:val="single" w:color="000000" w:themeColor="text2" w:sz="4" w:space="0"/>
+              <w:bottom w:val="single" w:color="000000" w:themeColor="text2" w:sz="4" w:space="0"/>
+              <w:right w:val="single" w:color="000000" w:themeColor="text2" w:sz="4" w:space="0"/>
+            </w:tcBorders>
+            <w:tcMar/>
+          </w:tcPr>
+          <w:p>
+            <w:pPr>
+              <w:pStyle w:val="normal1"/>
+              <w:jc w:val="both"/>
+              <w:rPr>
+                <w:rFonts w:ascii="Times New Roman" w:hAnsi="Times New Roman" w:eastAsia="Times New Roman" w:cs="Times New Roman"/>
+                <w:noProof w:val="0"/>
+                <w:lang w:val="en-US"/>
+              </w:rPr>
+            </w:pPr>
+            <w:r>
+              <w:rPr>
+                <w:rFonts w:ascii="Times New Roman" w:hAnsi="Times New Roman" w:eastAsia="Times New Roman" w:cs="Times New Roman"/>
+                <w:noProof w:val="0"/>
+                <w:lang w:val="en-US"/>
+              </w:rPr>
+              <w:t>Server.js/app.py</w:t>
+            </w:r>
+          </w:p>
+        </w:tc>
+        <w:tc>
+          <w:tcPr>
+            <w:tcW w:w="1050" w:type="dxa"/>
+            <w:tcBorders>
+              <w:top w:val="single" w:color="000000" w:themeColor="text2" w:sz="4" w:space="0"/>
+              <w:left w:val="single" w:color="000000" w:themeColor="text2" w:sz="4" w:space="0"/>
+              <w:bottom w:val="single" w:color="000000" w:themeColor="text2" w:sz="4" w:space="0"/>
+              <w:right w:val="single" w:color="000000" w:themeColor="text2" w:sz="4" w:space="0"/>
+            </w:tcBorders>
+            <w:tcMar/>
+          </w:tcPr>
+          <w:p>
+            <w:pPr>
+              <w:pStyle w:val="normal1"/>
+              <w:jc w:val="both"/>
+              <w:rPr>
+                <w:rFonts w:ascii="Times New Roman" w:hAnsi="Times New Roman" w:eastAsia="Times New Roman" w:cs="Times New Roman"/>
+                <w:noProof w:val="0"/>
+                <w:lang w:val="en-US"/>
+              </w:rPr>
+            </w:pPr>
+            <w:r>
+              <w:rPr>
+                <w:rFonts w:ascii="Times New Roman" w:hAnsi="Times New Roman" w:eastAsia="Times New Roman" w:cs="Times New Roman"/>
+                <w:noProof w:val="0"/>
+                <w:lang w:val="en-US"/>
+              </w:rPr>
+              <w:t>TC-04</w:t>
+            </w:r>
+          </w:p>
+        </w:tc>
+        <w:tc>
+          <w:tcPr>
+            <w:tcW w:w="1047" w:type="dxa"/>
+            <w:tcBorders>
+              <w:top w:val="single" w:color="000000" w:themeColor="text2" w:sz="4" w:space="0"/>
+              <w:left w:val="single" w:color="000000" w:themeColor="text2" w:sz="4" w:space="0"/>
+              <w:bottom w:val="single" w:color="000000" w:themeColor="text2" w:sz="4" w:space="0"/>
+              <w:right w:val="single" w:color="000000" w:themeColor="text2" w:sz="4" w:space="0"/>
+            </w:tcBorders>
+            <w:tcMar/>
+          </w:tcPr>
+          <w:p>
+            <w:pPr>
+              <w:pStyle w:val="normal1"/>
+              <w:jc w:val="both"/>
+              <w:rPr>
+                <w:rFonts w:ascii="Times New Roman" w:hAnsi="Times New Roman" w:eastAsia="Times New Roman" w:cs="Times New Roman"/>
+              </w:rPr>
+            </w:pPr>
+          </w:p>
+        </w:tc>
+      </w:tr>
+      <w:tr>
+        <w:trPr>
+          <w:trHeight w:val="252"/>
+        </w:trPr>
+        <w:tc>
+          <w:tcPr>
+            <w:tcW w:w="645" w:type="dxa"/>
+            <w:tcBorders>
+              <w:top w:val="single" w:color="000000" w:themeColor="text2" w:sz="4" w:space="0"/>
+              <w:left w:val="single" w:color="000000" w:themeColor="text2" w:sz="4" w:space="0"/>
+              <w:bottom w:val="single" w:color="000000" w:themeColor="text2" w:sz="4" w:space="0"/>
+              <w:right w:val="single" w:color="000000" w:themeColor="text2" w:sz="4" w:space="0"/>
+            </w:tcBorders>
+            <w:tcMar/>
+          </w:tcPr>
+          <w:p>
+            <w:pPr>
+              <w:pStyle w:val="normal1"/>
+              <w:jc w:val="both"/>
+              <w:rPr>
+                <w:rFonts w:ascii="Times New Roman" w:hAnsi="Times New Roman" w:eastAsia="Times New Roman" w:cs="Times New Roman"/>
+              </w:rPr>
+            </w:pPr>
+            <w:r>
+              <w:rPr>
+                <w:rFonts w:ascii="Times New Roman" w:hAnsi="Times New Roman" w:eastAsia="Times New Roman" w:cs="Times New Roman"/>
+              </w:rPr>
+              <w:t>5</w:t>
+            </w:r>
+          </w:p>
+        </w:tc>
+        <w:tc>
+          <w:tcPr>
+            <w:tcW w:w="1095" w:type="dxa"/>
+            <w:tcBorders>
+              <w:top w:val="single" w:color="000000" w:themeColor="text2" w:sz="4" w:space="0"/>
+              <w:left w:val="single" w:color="000000" w:themeColor="text2" w:sz="4" w:space="0"/>
+              <w:bottom w:val="single" w:color="000000" w:themeColor="text2" w:sz="4" w:space="0"/>
+              <w:right w:val="single" w:color="000000" w:themeColor="text2" w:sz="4" w:space="0"/>
+            </w:tcBorders>
+            <w:tcMar/>
+          </w:tcPr>
+          <w:p>
+            <w:pPr>
+              <w:pStyle w:val="normal1"/>
+              <w:jc w:val="both"/>
+              <w:rPr>
+                <w:rFonts w:ascii="Times New Roman" w:hAnsi="Times New Roman" w:eastAsia="Times New Roman" w:cs="Times New Roman"/>
+                <w:noProof w:val="0"/>
+                <w:lang w:val="en-US"/>
+              </w:rPr>
+            </w:pPr>
+            <w:r>
+              <w:rPr>
+                <w:rFonts w:ascii="Times New Roman" w:hAnsi="Times New Roman" w:eastAsia="Times New Roman" w:cs="Times New Roman"/>
+                <w:noProof w:val="0"/>
+                <w:lang w:val="en-US"/>
+              </w:rPr>
+              <w:t>REQ-4</w:t>
+            </w:r>
+          </w:p>
+        </w:tc>
+        <w:tc>
+          <w:tcPr>
+            <w:tcW w:w="1530" w:type="dxa"/>
+            <w:tcBorders>
+              <w:top w:val="single" w:color="000000" w:themeColor="text2" w:sz="4" w:space="0"/>
+              <w:left w:val="single" w:color="000000" w:themeColor="text2" w:sz="4" w:space="0"/>
+              <w:bottom w:val="single" w:color="000000" w:themeColor="text2" w:sz="4" w:space="0"/>
+              <w:right w:val="single" w:color="000000" w:themeColor="text2" w:sz="4" w:space="0"/>
+            </w:tcBorders>
+            <w:tcMar/>
+          </w:tcPr>
+          <w:p>
+            <w:pPr>
+              <w:pStyle w:val="normal1"/>
+              <w:jc w:val="both"/>
+              <w:rPr>
+                <w:rFonts w:ascii="Times New Roman" w:hAnsi="Times New Roman" w:eastAsia="Times New Roman" w:cs="Times New Roman"/>
+                <w:noProof w:val="0"/>
+                <w:lang w:val="en-US"/>
+              </w:rPr>
+            </w:pPr>
+            <w:r>
+              <w:rPr>
+                <w:rFonts w:ascii="Times New Roman" w:hAnsi="Times New Roman" w:eastAsia="Times New Roman" w:cs="Times New Roman"/>
+                <w:noProof w:val="0"/>
+                <w:lang w:val="en-US"/>
+              </w:rPr>
+              <w:t>Add a server-side timestamp to every message</w:t>
+            </w:r>
+          </w:p>
+        </w:tc>
+        <w:tc>
+          <w:tcPr>
+            <w:tcW w:w="1485" w:type="dxa"/>
+            <w:tcBorders>
+              <w:top w:val="single" w:color="000000" w:themeColor="text2" w:sz="4"/>
+              <w:left w:val="single" w:color="000000" w:themeColor="text2" w:sz="4"/>
+              <w:bottom w:val="single" w:color="000000" w:themeColor="text2" w:sz="4"/>
+              <w:right w:val="single" w:color="000000" w:themeColor="text2" w:sz="4"/>
+            </w:tcBorders>
+            <w:tcMar/>
+          </w:tcPr>
+          <w:p>
+            <w:pPr>
+              <w:pStyle w:val="normal1"/>
+              <w:jc w:val="both"/>
+              <w:rPr>
+                <w:rFonts w:ascii="Times New Roman" w:hAnsi="Times New Roman" w:eastAsia="Times New Roman" w:cs="Times New Roman"/>
+                <w:noProof w:val="0"/>
+                <w:lang w:val="en-US"/>
+              </w:rPr>
+            </w:pPr>
+            <w:r>
+              <w:rPr>
+                <w:rFonts w:ascii="Times New Roman" w:hAnsi="Times New Roman" w:eastAsia="Times New Roman" w:cs="Times New Roman"/>
+                <w:noProof w:val="0"/>
+                <w:lang w:val="en-US"/>
+              </w:rPr>
+              <w:t>Sec 4.2</w:t>
+            </w:r>
+          </w:p>
+        </w:tc>
+        <w:tc>
+          <w:tcPr>
+            <w:tcW w:w="1260" w:type="dxa"/>
+            <w:tcBorders>
+              <w:top w:val="single" w:color="000000" w:themeColor="text2" w:sz="4" w:space="0"/>
+              <w:left w:val="single" w:color="000000" w:themeColor="text2" w:sz="4" w:space="0"/>
+              <w:bottom w:val="single" w:color="000000" w:themeColor="text2" w:sz="4" w:space="0"/>
+              <w:right w:val="single" w:color="000000" w:themeColor="text2" w:sz="4" w:space="0"/>
+            </w:tcBorders>
+            <w:tcMar/>
+          </w:tcPr>
+          <w:p>
+            <w:pPr>
+              <w:pStyle w:val="normal1"/>
+              <w:jc w:val="both"/>
+              <w:rPr>
+                <w:rFonts w:ascii="Times New Roman" w:hAnsi="Times New Roman" w:eastAsia="Times New Roman" w:cs="Times New Roman"/>
+                <w:noProof w:val="0"/>
+                <w:lang w:val="en-US"/>
+              </w:rPr>
+            </w:pPr>
+            <w:r>
+              <w:rPr>
+                <w:rFonts w:ascii="Times New Roman" w:hAnsi="Times New Roman" w:eastAsia="Times New Roman" w:cs="Times New Roman"/>
+                <w:noProof w:val="0"/>
+                <w:lang w:val="en-US"/>
+              </w:rPr>
+              <w:t>Message Handler</w:t>
+            </w:r>
+          </w:p>
+        </w:tc>
+        <w:tc>
+          <w:tcPr>
+            <w:tcW w:w="1380" w:type="dxa"/>
+            <w:tcBorders>
+              <w:top w:val="single" w:color="000000" w:themeColor="text2" w:sz="4" w:space="0"/>
+              <w:left w:val="single" w:color="000000" w:themeColor="text2" w:sz="4" w:space="0"/>
+              <w:bottom w:val="single" w:color="000000" w:themeColor="text2" w:sz="4" w:space="0"/>
+              <w:right w:val="single" w:color="000000" w:themeColor="text2" w:sz="4" w:space="0"/>
+            </w:tcBorders>
+            <w:tcMar/>
+          </w:tcPr>
+          <w:p>
+            <w:pPr>
+              <w:pStyle w:val="normal1"/>
+              <w:jc w:val="both"/>
+              <w:rPr>
+                <w:rFonts w:ascii="Times New Roman" w:hAnsi="Times New Roman" w:eastAsia="Times New Roman" w:cs="Times New Roman"/>
+                <w:noProof w:val="0"/>
+                <w:lang w:val="en-US"/>
+              </w:rPr>
+            </w:pPr>
+            <w:r>
+              <w:rPr>
+                <w:rFonts w:ascii="Times New Roman" w:hAnsi="Times New Roman" w:eastAsia="Times New Roman" w:cs="Times New Roman"/>
+                <w:noProof w:val="0"/>
+                <w:lang w:val="en-US"/>
+              </w:rPr>
+              <w:t>Server.js/app.py</w:t>
+            </w:r>
+          </w:p>
+        </w:tc>
+        <w:tc>
+          <w:tcPr>
+            <w:tcW w:w="1050" w:type="dxa"/>
+            <w:tcBorders>
+              <w:top w:val="single" w:color="000000" w:themeColor="text2" w:sz="4" w:space="0"/>
+              <w:left w:val="single" w:color="000000" w:themeColor="text2" w:sz="4" w:space="0"/>
+              <w:bottom w:val="single" w:color="000000" w:themeColor="text2" w:sz="4" w:space="0"/>
+              <w:right w:val="single" w:color="000000" w:themeColor="text2" w:sz="4" w:space="0"/>
+            </w:tcBorders>
+            <w:tcMar/>
+          </w:tcPr>
+          <w:p>
+            <w:pPr>
+              <w:pStyle w:val="normal1"/>
+              <w:jc w:val="both"/>
+              <w:rPr>
+                <w:rFonts w:ascii="Times New Roman" w:hAnsi="Times New Roman" w:eastAsia="Times New Roman" w:cs="Times New Roman"/>
+                <w:noProof w:val="0"/>
+                <w:lang w:val="en-US"/>
+              </w:rPr>
+            </w:pPr>
+            <w:r>
+              <w:rPr>
+                <w:rFonts w:ascii="Times New Roman" w:hAnsi="Times New Roman" w:eastAsia="Times New Roman" w:cs="Times New Roman"/>
+                <w:noProof w:val="0"/>
+                <w:lang w:val="en-US"/>
+              </w:rPr>
+              <w:t>TC-05</w:t>
+            </w:r>
+          </w:p>
+        </w:tc>
+        <w:tc>
+          <w:tcPr>
+            <w:tcW w:w="1047" w:type="dxa"/>
             <w:tcBorders>
               <w:top w:val="single" w:color="000000" w:themeColor="text2" w:sz="4" w:space="0"/>
               <w:left w:val="single" w:color="000000" w:themeColor="text2" w:sz="4" w:space="0"/>

</xml_diff>